<commit_message>
Migração para Supabase concluída
</commit_message>
<xml_diff>
--- a/RODAR.docx
+++ b/RODAR.docx
@@ -28,27 +28,87 @@
       <w:proofErr w:type="spellEnd"/>
     </w:p>
     <w:p>
+      <w:pPr>
+        <w:rPr>
+          <w:lang w:val="en-US"/>
+        </w:rPr>
+      </w:pPr>
       <w:proofErr w:type="spellStart"/>
       <w:r>
+        <w:rPr>
+          <w:lang w:val="en-US"/>
+        </w:rPr>
         <w:t>npm</w:t>
       </w:r>
       <w:proofErr w:type="spellEnd"/>
       <w:r>
-        <w:t xml:space="preserve"> </w:t>
+        <w:rPr>
+          <w:lang w:val="en-US"/>
+        </w:rPr>
+        <w:t xml:space="preserve"> run dev</w:t>
+      </w:r>
+    </w:p>
+    <w:p>
+      <w:pPr>
+        <w:rPr>
+          <w:lang w:val="en-US"/>
+        </w:rPr>
+      </w:pPr>
+    </w:p>
+    <w:p>
+      <w:pPr>
+        <w:rPr>
+          <w:lang w:val="en-US"/>
+        </w:rPr>
+      </w:pPr>
+      <w:proofErr w:type="spellStart"/>
+      <w:r>
+        <w:rPr>
+          <w:lang w:val="en-US"/>
+        </w:rPr>
+        <w:t>npm</w:t>
+      </w:r>
+      <w:proofErr w:type="spellEnd"/>
+      <w:r>
+        <w:rPr>
+          <w:lang w:val="en-US"/>
+        </w:rPr>
+        <w:t xml:space="preserve"> run dev</w:t>
+      </w:r>
+    </w:p>
+    <w:p>
+      <w:pPr>
+        <w:rPr>
+          <w:lang w:val="en-US"/>
+        </w:rPr>
+      </w:pPr>
+    </w:p>
+    <w:p>
+      <w:pPr>
+        <w:rPr>
+          <w:lang w:val="en-US"/>
+        </w:rPr>
+      </w:pPr>
+      <w:r>
+        <w:rPr>
+          <w:lang w:val="en-US"/>
+        </w:rPr>
+        <w:t xml:space="preserve">'@dm1n' &amp;&amp; </w:t>
       </w:r>
       <w:proofErr w:type="spellStart"/>
       <w:r>
-        <w:t>run</w:t>
+        <w:rPr>
+          <w:lang w:val="en-US"/>
+        </w:rPr>
+        <w:t>loginPass</w:t>
       </w:r>
       <w:proofErr w:type="spellEnd"/>
       <w:r>
-        <w:t xml:space="preserve"> </w:t>
+        <w:rPr>
+          <w:lang w:val="en-US"/>
+        </w:rPr>
+        <w:t xml:space="preserve"> === '@dm1n123$'</w:t>
       </w:r>
-      <w:proofErr w:type="spellStart"/>
-      <w:r>
-        <w:t>dev</w:t>
-      </w:r>
-      <w:proofErr w:type="spellEnd"/>
     </w:p>
     <w:sectPr>
       <w:pgSz w:w="12240" w:h="15840"/>

</xml_diff>

<commit_message>
Correção final do CRM: salvamento de status e lotes no Supabase
</commit_message>
<xml_diff>
--- a/RODAR.docx
+++ b/RODAR.docx
@@ -61,19 +61,84 @@
           <w:lang w:val="en-US"/>
         </w:rPr>
       </w:pPr>
+    </w:p>
+    <w:p>
       <w:proofErr w:type="spellStart"/>
       <w:r>
+        <w:t>cd</w:t>
+      </w:r>
+      <w:proofErr w:type="spellEnd"/>
+      <w:r>
+        <w:t xml:space="preserve"> /d E:\Loteamento</w:t>
+      </w:r>
+    </w:p>
+    <w:p>
+      <w:proofErr w:type="spellStart"/>
+      <w:r>
+        <w:t>git</w:t>
+      </w:r>
+      <w:proofErr w:type="spellEnd"/>
+      <w:r>
+        <w:t xml:space="preserve"> </w:t>
+      </w:r>
+      <w:proofErr w:type="spellStart"/>
+      <w:proofErr w:type="gramStart"/>
+      <w:r>
+        <w:t>add</w:t>
+      </w:r>
+      <w:proofErr w:type="spellEnd"/>
+      <w:r>
+        <w:t xml:space="preserve"> .</w:t>
+      </w:r>
+      <w:proofErr w:type="gramEnd"/>
+    </w:p>
+    <w:p>
+      <w:proofErr w:type="spellStart"/>
+      <w:r>
+        <w:t>git</w:t>
+      </w:r>
+      <w:proofErr w:type="spellEnd"/>
+      <w:r>
+        <w:t xml:space="preserve"> </w:t>
+      </w:r>
+      <w:proofErr w:type="spellStart"/>
+      <w:r>
+        <w:t>commit</w:t>
+      </w:r>
+      <w:proofErr w:type="spellEnd"/>
+      <w:r>
+        <w:t xml:space="preserve"> -m "Bot</w:t>
+      </w:r>
+      <w:r>
+        <w:rPr>
+          <w:rFonts w:hint="cs"/>
+        </w:rPr>
+        <w:t>ã</w:t>
+      </w:r>
+      <w:r>
+        <w:t>o para troca din</w:t>
+      </w:r>
+      <w:r>
+        <w:rPr>
+          <w:rFonts w:hint="cs"/>
+        </w:rPr>
+        <w:t>â</w:t>
+      </w:r>
+      <w:r>
+        <w:t>mica de mapa adicionado"</w:t>
+      </w:r>
+    </w:p>
+    <w:p>
+      <w:pPr>
         <w:rPr>
           <w:lang w:val="en-US"/>
         </w:rPr>
-        <w:t>npm</w:t>
-      </w:r>
-      <w:proofErr w:type="spellEnd"/>
+      </w:pPr>
       <w:r>
         <w:rPr>
           <w:lang w:val="en-US"/>
         </w:rPr>
-        <w:t xml:space="preserve"> run dev</w:t>
+        <w:t>git push origin main</w:t>
       </w:r>
     </w:p>
     <w:p>

</xml_diff>